<commit_message>
LATEST UPDATE, ADDED OTHER TEACHERS AND MODIFIED TEMPLATES
</commit_message>
<xml_diff>
--- a/resources/templates/SAMPLE APPOINTMENT FORM FOR SHS.docx
+++ b/resources/templates/SAMPLE APPOINTMENT FORM FOR SHS.docx
@@ -1508,6 +1508,39 @@
                               <w:t>${position} - ${senior_high_strand}</w:t>
                             </w:r>
                           </w:p>
+                          <w:p>
+                            <w:pPr>
+                              <w:jc w:val="center"/>
+                              <w:rPr>
+                                <w:b/>
+                                <w:bCs/>
+                                <w:sz w:val="22"/>
+                                <w:szCs w:val="22"/>
+                              </w:rPr>
+                            </w:pPr>
+                            <w:r>
+                              <w:rPr>
+                                <w:b/>
+                                <w:bCs/>
+                                <w:sz w:val="22"/>
+                                <w:szCs w:val="22"/>
+                              </w:rPr>
+                              <w:t>(SHS – Academic Track and Core Subjects)</w:t>
+                            </w:r>
+                          </w:p>
+                          <w:p>
+                            <w:pPr>
+                              <w:jc w:val="center"/>
+                              <w:rPr>
+                                <w:rFonts w:hint="default"/>
+                                <w:b/>
+                                <w:bCs/>
+                                <w:sz w:val="22"/>
+                                <w:szCs w:val="22"/>
+                                <w:lang w:val="en-PH"/>
+                              </w:rPr>
+                            </w:pPr>
+                          </w:p>
                         </w:txbxContent>
                       </wps:txbx>
                       <wps:bodyPr rot="0" vert="horz" wrap="square" lIns="91440" tIns="0" rIns="91440" bIns="0" anchor="b" anchorCtr="0" upright="1">
@@ -1551,6 +1584,39 @@
                         </w:rPr>
                         <w:t>${position} - ${senior_high_strand}</w:t>
                       </w:r>
+                    </w:p>
+                    <w:p>
+                      <w:pPr>
+                        <w:jc w:val="center"/>
+                        <w:rPr>
+                          <w:b/>
+                          <w:bCs/>
+                          <w:sz w:val="22"/>
+                          <w:szCs w:val="22"/>
+                        </w:rPr>
+                      </w:pPr>
+                      <w:r>
+                        <w:rPr>
+                          <w:b/>
+                          <w:bCs/>
+                          <w:sz w:val="22"/>
+                          <w:szCs w:val="22"/>
+                        </w:rPr>
+                        <w:t>(SHS – Academic Track and Core Subjects)</w:t>
+                      </w:r>
+                    </w:p>
+                    <w:p>
+                      <w:pPr>
+                        <w:jc w:val="center"/>
+                        <w:rPr>
+                          <w:rFonts w:hint="default"/>
+                          <w:b/>
+                          <w:bCs/>
+                          <w:sz w:val="22"/>
+                          <w:szCs w:val="22"/>
+                          <w:lang w:val="en-PH"/>
+                        </w:rPr>
+                      </w:pPr>
                     </w:p>
                   </w:txbxContent>
                 </v:textbox>
@@ -2698,6 +2764,8 @@
         </w:rPr>
         <w:tab/>
       </w:r>
+      <w:bookmarkStart w:id="1" w:name="_GoBack"/>
+      <w:bookmarkEnd w:id="1"/>
     </w:p>
     <w:p>
       <w:pPr>
@@ -3764,8 +3832,6 @@
           <w:szCs w:val="22"/>
         </w:rPr>
       </w:pPr>
-      <w:bookmarkStart w:id="1" w:name="_GoBack"/>
-      <w:bookmarkEnd w:id="1"/>
       <w:r>
         <w:rPr>
           <w:color w:val="000000"/>
@@ -12702,6 +12768,7 @@
                           </w:p>
                           <w:p>
                             <w:pPr>
+                              <w:jc w:val="center"/>
                               <w:rPr>
                                 <w:rFonts w:hint="default"/>
                                 <w:b/>
@@ -12711,44 +12778,6 @@
                                 <w:lang w:val="en-PH"/>
                               </w:rPr>
                             </w:pPr>
-                            <w:r>
-                              <w:rPr>
-                                <w:b/>
-                                <w:sz w:val="22"/>
-                                <w:szCs w:val="22"/>
-                                <w:lang w:val="en-PH"/>
-                              </w:rPr>
-                              <w:t xml:space="preserve">                               </w:t>
-                            </w:r>
-                            <w:r>
-                              <w:rPr>
-                                <w:rFonts w:hint="default"/>
-                                <w:b/>
-                                <w:sz w:val="22"/>
-                                <w:szCs w:val="22"/>
-                                <w:lang w:val="en-PH"/>
-                              </w:rPr>
-                              <w:t xml:space="preserve">     </w:t>
-                            </w:r>
-                            <w:r>
-                              <w:rPr>
-                                <w:b/>
-                                <w:sz w:val="22"/>
-                                <w:szCs w:val="22"/>
-                                <w:lang w:val="en-PH"/>
-                              </w:rPr>
-                              <w:t xml:space="preserve"> </w:t>
-                            </w:r>
-                            <w:r>
-                              <w:rPr>
-                                <w:rFonts w:hint="default"/>
-                                <w:b/>
-                                <w:sz w:val="22"/>
-                                <w:szCs w:val="22"/>
-                                <w:lang w:val="en-PH"/>
-                              </w:rPr>
-                              <w:t xml:space="preserve"> </w:t>
-                            </w:r>
                             <w:r>
                               <w:rPr>
                                 <w:rFonts w:hint="default"/>
@@ -12872,6 +12901,7 @@
                     </w:p>
                     <w:p>
                       <w:pPr>
+                        <w:jc w:val="center"/>
                         <w:rPr>
                           <w:rFonts w:hint="default"/>
                           <w:b/>
@@ -12881,44 +12911,6 @@
                           <w:lang w:val="en-PH"/>
                         </w:rPr>
                       </w:pPr>
-                      <w:r>
-                        <w:rPr>
-                          <w:b/>
-                          <w:sz w:val="22"/>
-                          <w:szCs w:val="22"/>
-                          <w:lang w:val="en-PH"/>
-                        </w:rPr>
-                        <w:t xml:space="preserve">                               </w:t>
-                      </w:r>
-                      <w:r>
-                        <w:rPr>
-                          <w:rFonts w:hint="default"/>
-                          <w:b/>
-                          <w:sz w:val="22"/>
-                          <w:szCs w:val="22"/>
-                          <w:lang w:val="en-PH"/>
-                        </w:rPr>
-                        <w:t xml:space="preserve">     </w:t>
-                      </w:r>
-                      <w:r>
-                        <w:rPr>
-                          <w:b/>
-                          <w:sz w:val="22"/>
-                          <w:szCs w:val="22"/>
-                          <w:lang w:val="en-PH"/>
-                        </w:rPr>
-                        <w:t xml:space="preserve"> </w:t>
-                      </w:r>
-                      <w:r>
-                        <w:rPr>
-                          <w:rFonts w:hint="default"/>
-                          <w:b/>
-                          <w:sz w:val="22"/>
-                          <w:szCs w:val="22"/>
-                          <w:lang w:val="en-PH"/>
-                        </w:rPr>
-                        <w:t xml:space="preserve"> </w:t>
-                      </w:r>
                       <w:r>
                         <w:rPr>
                           <w:rFonts w:hint="default"/>
@@ -14165,6 +14157,29 @@
 </file>
 
 <file path=customXml/item2.xml><?xml version="1.0" encoding="utf-8"?>
+<b:Sources xmlns:b="http://schemas.openxmlformats.org/officeDocument/2006/bibliography" xmlns="http://schemas.openxmlformats.org/officeDocument/2006/bibliography" SelectedStyle="\APASixthEditionOfficeOnline.xsl" StyleName="APA" Version="6"/>
+</file>
+
+<file path=customXml/item3.xml><?xml version="1.0" encoding="utf-8"?>
+<?mso-contentType ?>
+<FormTemplates xmlns="http://schemas.microsoft.com/sharepoint/v3/contenttype/forms">
+  <Display>DocumentLibraryForm</Display>
+  <Edit>DocumentLibraryForm</Edit>
+  <New>DocumentLibraryForm</New>
+</FormTemplates>
+</file>
+
+<file path=customXml/item4.xml><?xml version="1.0" encoding="utf-8"?>
+<p:properties xmlns:p="http://schemas.microsoft.com/office/2006/metadata/properties" xmlns:xsi="http://www.w3.org/2001/XMLSchema-instance" xmlns:pc="http://schemas.microsoft.com/office/infopath/2007/PartnerControls">
+  <documentManagement>
+    <lcf76f155ced4ddcb4097134ff3c332f xmlns="61535973-5223-4bf4-bdcc-6c7df9166676">
+      <Terms xmlns="http://schemas.microsoft.com/office/infopath/2007/PartnerControls"/>
+    </lcf76f155ced4ddcb4097134ff3c332f>
+  </documentManagement>
+</p:properties>
+</file>
+
+<file path=customXml/item5.xml><?xml version="1.0" encoding="utf-8"?>
 <ct:contentTypeSchema xmlns:ct="http://schemas.microsoft.com/office/2006/metadata/contentType" xmlns:ma="http://schemas.microsoft.com/office/2006/metadata/properties/metaAttributes" ct:_="" ma:_="" ma:contentTypeName="Document" ma:contentTypeID="0x0101004061E9AFAF7CA04B82F43B8373745610" ma:contentTypeVersion="15" ma:contentTypeDescription="Create a new document." ma:contentTypeScope="" ma:versionID="3807037a0979b6ce9196f65959799221">
   <xsd:schema xmlns:xsd="http://www.w3.org/2001/XMLSchema" xmlns:xs="http://www.w3.org/2001/XMLSchema" xmlns:p="http://schemas.microsoft.com/office/2006/metadata/properties" xmlns:ns2="61535973-5223-4bf4-bdcc-6c7df9166676" xmlns:ns3="ab5b6d4b-4285-4680-b1ee-6fe31a63f7d7" targetNamespace="http://schemas.microsoft.com/office/2006/metadata/properties" ma:root="true" ma:fieldsID="0698124c94b6a25b909cbe33b647c32f" ns2:_="" ns3:_="">
     <xsd:import namespace="61535973-5223-4bf4-bdcc-6c7df9166676"/>
@@ -14395,29 +14410,6 @@
 </ct:contentTypeSchema>
 </file>
 
-<file path=customXml/item3.xml><?xml version="1.0" encoding="utf-8"?>
-<p:properties xmlns:p="http://schemas.microsoft.com/office/2006/metadata/properties" xmlns:xsi="http://www.w3.org/2001/XMLSchema-instance" xmlns:pc="http://schemas.microsoft.com/office/infopath/2007/PartnerControls">
-  <documentManagement>
-    <lcf76f155ced4ddcb4097134ff3c332f xmlns="61535973-5223-4bf4-bdcc-6c7df9166676">
-      <Terms xmlns="http://schemas.microsoft.com/office/infopath/2007/PartnerControls"/>
-    </lcf76f155ced4ddcb4097134ff3c332f>
-  </documentManagement>
-</p:properties>
-</file>
-
-<file path=customXml/item4.xml><?xml version="1.0" encoding="utf-8"?>
-<?mso-contentType ?>
-<FormTemplates xmlns="http://schemas.microsoft.com/sharepoint/v3/contenttype/forms">
-  <Display>DocumentLibraryForm</Display>
-  <Edit>DocumentLibraryForm</Edit>
-  <New>DocumentLibraryForm</New>
-</FormTemplates>
-</file>
-
-<file path=customXml/item5.xml><?xml version="1.0" encoding="utf-8"?>
-<b:Sources xmlns:b="http://schemas.openxmlformats.org/officeDocument/2006/bibliography" xmlns="http://schemas.openxmlformats.org/officeDocument/2006/bibliography" SelectedStyle="\APASixthEditionOfficeOnline.xsl" StyleName="APA" Version="6"/>
-</file>
-
 <file path=customXml/itemProps1.xml><?xml version="1.0" encoding="utf-8"?>
 <ds:datastoreItem xmlns:ds="http://schemas.openxmlformats.org/officeDocument/2006/customXml" ds:itemID="{B1977F7D-205B-4081-913C-38D41E755F92}">
   <ds:schemaRefs>
@@ -14427,25 +14419,25 @@
 </file>
 
 <file path=customXml/itemProps2.xml><?xml version="1.0" encoding="utf-8"?>
-<ds:datastoreItem xmlns:ds="http://schemas.openxmlformats.org/officeDocument/2006/customXml" ds:itemID="{4C05208C-5CEB-4531-9757-7015881DFAD1}">
+<ds:datastoreItem xmlns:ds="http://schemas.openxmlformats.org/officeDocument/2006/customXml" ds:itemID="{547534C1-321D-4C0B-9D51-AA133DA5F584}">
   <ds:schemaRefs/>
 </ds:datastoreItem>
 </file>
 
 <file path=customXml/itemProps3.xml><?xml version="1.0" encoding="utf-8"?>
+<ds:datastoreItem xmlns:ds="http://schemas.openxmlformats.org/officeDocument/2006/customXml" ds:itemID="{1A5AAE97-7767-4350-BC4C-D8BD8B855F0B}">
+  <ds:schemaRefs/>
+</ds:datastoreItem>
+</file>
+
+<file path=customXml/itemProps4.xml><?xml version="1.0" encoding="utf-8"?>
 <ds:datastoreItem xmlns:ds="http://schemas.openxmlformats.org/officeDocument/2006/customXml" ds:itemID="{DD5ADA96-6B37-44C9-916B-603F7A79B272}">
   <ds:schemaRefs/>
 </ds:datastoreItem>
 </file>
 
-<file path=customXml/itemProps4.xml><?xml version="1.0" encoding="utf-8"?>
-<ds:datastoreItem xmlns:ds="http://schemas.openxmlformats.org/officeDocument/2006/customXml" ds:itemID="{1A5AAE97-7767-4350-BC4C-D8BD8B855F0B}">
-  <ds:schemaRefs/>
-</ds:datastoreItem>
-</file>
-
 <file path=customXml/itemProps5.xml><?xml version="1.0" encoding="utf-8"?>
-<ds:datastoreItem xmlns:ds="http://schemas.openxmlformats.org/officeDocument/2006/customXml" ds:itemID="{547534C1-321D-4C0B-9D51-AA133DA5F584}">
+<ds:datastoreItem xmlns:ds="http://schemas.openxmlformats.org/officeDocument/2006/customXml" ds:itemID="{4C05208C-5CEB-4531-9757-7015881DFAD1}">
   <ds:schemaRefs/>
 </ds:datastoreItem>
 </file>
</xml_diff>